<commit_message>
Correct Antigone Oreopoulos reviewed sample
</commit_message>
<xml_diff>
--- a/reviewed/lighter-side-s02e77-antigone-oriopoulos/transcript.docx
+++ b/reviewed/lighter-side-s02e77-antigone-oriopoulos/transcript.docx
@@ -13,7 +13,7 @@
         <w:rPr>
           <w:b/>
         </w:rPr>
-        <w:t>Announcer</w:t>
+        <w:t>Show narrator</w:t>
       </w:r>
       <w:r>
         <w:rPr/>
@@ -461,7 +461,7 @@
       </w:r>
       <w:r>
         <w:rPr/>
-        <w:t xml:space="preserve"> [00:08:15–00:08:15]</w:t>
+        <w:t xml:space="preserve"> [00:08:16–00:08:17]</w:t>
         <w:br/>
         <w:t>Right.</w:t>
       </w:r>
@@ -617,7 +617,7 @@
         <w:rPr>
           <w:b/>
         </w:rPr>
-        <w:t>Announcer: Tip of the week</w:t>
+        <w:t>David Kaufer</w:t>
       </w:r>
       <w:r>
         <w:rPr/>
@@ -703,11 +703,11 @@
         <w:rPr>
           <w:b/>
         </w:rPr>
-        <w:t>Announcer</w:t>
-      </w:r>
-      <w:r>
-        <w:rPr/>
-        <w:t xml:space="preserve"> [00:11:21–00:11:21]</w:t>
+        <w:t>David Kaufer</w:t>
+      </w:r>
+      <w:r>
+        <w:rPr/>
+        <w:t xml:space="preserve"> [00:11:21–00:11:22]</w:t>
         <w:br/>
         <w:t>Mm-hmm.</w:t>
       </w:r>
@@ -743,7 +743,7 @@
         <w:rPr>
           <w:b/>
         </w:rPr>
-        <w:t>Announcer: Tip of the week</w:t>
+        <w:t>David Kaufer</w:t>
       </w:r>
       <w:r>
         <w:rPr/>
@@ -803,11 +803,11 @@
         <w:rPr>
           <w:b/>
         </w:rPr>
-        <w:t>Announcer</w:t>
-      </w:r>
-      <w:r>
-        <w:rPr/>
-        <w:t xml:space="preserve"> [00:12:08–00:12:08]</w:t>
+        <w:t>David Kaufer</w:t>
+      </w:r>
+      <w:r>
+        <w:rPr/>
+        <w:t xml:space="preserve"> [00:12:08–00:12:09]</w:t>
         <w:br/>
         <w:t>No.</w:t>
       </w:r>
@@ -1029,7 +1029,7 @@
       </w:r>
       <w:r>
         <w:rPr/>
-        <w:t xml:space="preserve"> [00:14:53–00:14:53]</w:t>
+        <w:t xml:space="preserve"> [00:14:54–00:14:55]</w:t>
         <w:br/>
         <w:t>Yeah.</w:t>
       </w:r>
@@ -1087,11 +1087,11 @@
         <w:rPr>
           <w:b/>
         </w:rPr>
-        <w:t>Announcer</w:t>
-      </w:r>
-      <w:r>
-        <w:rPr/>
-        <w:t xml:space="preserve"> [00:15:44–00:15:44]</w:t>
+        <w:t>David Kaufer</w:t>
+      </w:r>
+      <w:r>
+        <w:rPr/>
+        <w:t xml:space="preserve"> [00:15:44–00:15:45]</w:t>
         <w:br/>
         <w:t>Yeah.</w:t>
       </w:r>
@@ -1739,7 +1739,7 @@
         <w:rPr>
           <w:b/>
         </w:rPr>
-        <w:t>Announcer: Tip of the week</w:t>
+        <w:t>David Kaufer</w:t>
       </w:r>
       <w:r>
         <w:rPr/>
@@ -1763,7 +1763,7 @@
       </w:r>
       <w:r>
         <w:rPr/>
-        <w:t xml:space="preserve"> [00:24:22–00:24:24]</w:t>
+        <w:t xml:space="preserve"> [00:24:23–00:24:28]</w:t>
         <w:br/>
         <w:t>And to get started. Early intervention. Yes.</w:t>
       </w:r>
@@ -1783,7 +1783,7 @@
       </w:r>
       <w:r>
         <w:rPr/>
-        <w:t xml:space="preserve"> [00:24:25–00:24:28]</w:t>
+        <w:t xml:space="preserve"> [00:24:28–00:24:29]</w:t>
         <w:br/>
         <w:t>Early? Start early intervention, you have to wait 5 years.</w:t>
       </w:r>
@@ -2071,7 +2071,7 @@
       </w:r>
       <w:r>
         <w:rPr/>
-        <w:t xml:space="preserve"> [00:29:46–00:29:46]</w:t>
+        <w:t xml:space="preserve"> [00:29:46–00:29:47]</w:t>
         <w:br/>
         <w:t>Oh, wow.</w:t>
       </w:r>
@@ -2471,11 +2471,11 @@
         <w:rPr>
           <w:b/>
         </w:rPr>
-        <w:t>Announcer: Tip of the week</w:t>
-      </w:r>
-      <w:r>
-        <w:rPr/>
-        <w:t xml:space="preserve"> [00:35:20–00:35:20]</w:t>
+        <w:t>David Kaufer</w:t>
+      </w:r>
+      <w:r>
+        <w:rPr/>
+        <w:t xml:space="preserve"> [00:35:20–00:35:21]</w:t>
         <w:br/>
         <w:t>Yeah.</w:t>
       </w:r>
@@ -2511,7 +2511,7 @@
         <w:rPr>
           <w:b/>
         </w:rPr>
-        <w:t>Announcer: Tip of the week</w:t>
+        <w:t>David Kaufer</w:t>
       </w:r>
       <w:r>
         <w:rPr/>
@@ -2673,11 +2673,11 @@
         <w:rPr>
           <w:b/>
         </w:rPr>
-        <w:t>Announcer</w:t>
-      </w:r>
-      <w:r>
-        <w:rPr/>
-        <w:t xml:space="preserve"> [00:38:31–00:38:31]</w:t>
+        <w:t>David Kaufer</w:t>
+      </w:r>
+      <w:r>
+        <w:rPr/>
+        <w:t xml:space="preserve"> [00:38:32–00:38:33]</w:t>
         <w:br/>
         <w:t>Right.</w:t>
       </w:r>
@@ -2717,7 +2717,7 @@
       </w:r>
       <w:r>
         <w:rPr/>
-        <w:t xml:space="preserve"> [00:39:17–00:39:17]</w:t>
+        <w:t xml:space="preserve"> [00:39:17–00:39:18]</w:t>
         <w:br/>
         <w:t>Yeah.</w:t>
       </w:r>
@@ -2881,7 +2881,7 @@
       </w:r>
       <w:r>
         <w:rPr/>
-        <w:t xml:space="preserve"> [00:42:09–00:42:09]</w:t>
+        <w:t xml:space="preserve"> [00:42:10–00:42:11]</w:t>
         <w:br/>
         <w:t>Correct.</w:t>
       </w:r>
@@ -2921,7 +2921,7 @@
       </w:r>
       <w:r>
         <w:rPr/>
-        <w:t xml:space="preserve"> [00:42:15–00:42:15]</w:t>
+        <w:t xml:space="preserve"> [00:42:15–00:42:16]</w:t>
         <w:br/>
         <w:t>Mm-hmm.</w:t>
       </w:r>
@@ -3083,7 +3083,7 @@
       </w:r>
       <w:r>
         <w:rPr/>
-        <w:t xml:space="preserve"> [00:43:32–00:43:44]</w:t>
+        <w:t xml:space="preserve"> [00:43:35–00:43:44]</w:t>
         <w:br/>
         <w:t>All those things that seem simple. All right. Well, I want to talk about, um, getting back into kind of the physiotherapy, you, you have a couple of unique areas of specialty, don't you?</w:t>
       </w:r>
@@ -3269,7 +3269,7 @@
       </w:r>
       <w:r>
         <w:rPr/>
-        <w:t xml:space="preserve"> [00:46:22–00:46:22]</w:t>
+        <w:t xml:space="preserve"> [00:46:22–00:46:23]</w:t>
         <w:br/>
         <w:t>I know and—</w:t>
       </w:r>
@@ -3367,11 +3367,11 @@
         <w:rPr>
           <w:b/>
         </w:rPr>
-        <w:t>Announcer: Tip of the week</w:t>
-      </w:r>
-      <w:r>
-        <w:rPr/>
-        <w:t xml:space="preserve"> [00:47:42–00:47:42]</w:t>
+        <w:t>David Kaufer</w:t>
+      </w:r>
+      <w:r>
+        <w:rPr/>
+        <w:t xml:space="preserve"> [00:47:42–00:47:43]</w:t>
         <w:br/>
         <w:t>Yeah.</w:t>
       </w:r>
@@ -3411,7 +3411,7 @@
       </w:r>
       <w:r>
         <w:rPr/>
-        <w:t xml:space="preserve"> [00:48:17–00:48:17]</w:t>
+        <w:t xml:space="preserve"> [00:48:18–00:48:19]</w:t>
         <w:br/>
         <w:t>Mm-hmm.</w:t>
       </w:r>
@@ -3451,7 +3451,7 @@
       </w:r>
       <w:r>
         <w:rPr/>
-        <w:t xml:space="preserve"> [00:48:47–00:48:47]</w:t>
+        <w:t xml:space="preserve"> [00:48:48–00:48:49]</w:t>
         <w:br/>
         <w:t>Oh, no.</w:t>
       </w:r>
@@ -3627,7 +3627,7 @@
         <w:rPr>
           <w:b/>
         </w:rPr>
-        <w:t>Announcer: Tip of the week</w:t>
+        <w:t>Tip of the Week narrator</w:t>
       </w:r>
       <w:r>
         <w:rPr/>
@@ -3773,11 +3773,11 @@
         <w:rPr>
           <w:b/>
         </w:rPr>
-        <w:t>Announcer</w:t>
-      </w:r>
-      <w:r>
-        <w:rPr/>
-        <w:t xml:space="preserve"> [00:52:39–00:52:39]</w:t>
+        <w:t>David Kaufer</w:t>
+      </w:r>
+      <w:r>
+        <w:rPr/>
+        <w:t xml:space="preserve"> [00:52:40–00:52:41]</w:t>
         <w:br/>
         <w:t>Yeah.</w:t>
       </w:r>
@@ -3813,7 +3813,7 @@
         <w:rPr>
           <w:b/>
         </w:rPr>
-        <w:t>Announcer</w:t>
+        <w:t>Show narrator</w:t>
       </w:r>
       <w:r>
         <w:rPr/>
@@ -4181,7 +4181,7 @@
       </w:r>
       <w:r>
         <w:rPr/>
-        <w:t xml:space="preserve"> [00:56:54–00:56:54]</w:t>
+        <w:t xml:space="preserve"> [00:56:54–00:56:55]</w:t>
         <w:br/>
         <w:t>Yeah.</w:t>
       </w:r>
@@ -4221,7 +4221,7 @@
       </w:r>
       <w:r>
         <w:rPr/>
-        <w:t xml:space="preserve"> [00:57:18–00:57:42]</w:t>
+        <w:t xml:space="preserve"> [00:57:19–00:57:46]</w:t>
         <w:br/>
         <w:t>Right. Yeah, same. And as, as, as much progress as Stone has made with his—actually, his intentional speech has improved greatly. And again, it's much more consistent in terms of matching up his, his actual intent. It's still not 100%, like, and so there'll be times that his speech will sound convincing, but, you know, to your point, you sit down like, okay, I'm gonna verify—tell me what you want.</w:t>
       </w:r>
@@ -4317,7 +4317,7 @@
         <w:rPr>
           <w:b/>
         </w:rPr>
-        <w:t>Announcer: Tip of the week</w:t>
+        <w:t>Tip of the Week narrator</w:t>
       </w:r>
       <w:r>
         <w:rPr/>
@@ -4419,7 +4419,7 @@
         <w:rPr>
           <w:b/>
         </w:rPr>
-        <w:t>Announcer</w:t>
+        <w:t>David Kaufer</w:t>
       </w:r>
       <w:r>
         <w:rPr/>
@@ -4503,7 +4503,7 @@
         <w:rPr>
           <w:b/>
         </w:rPr>
-        <w:t>Announcer: Tip of the week</w:t>
+        <w:t>David Kaufer</w:t>
       </w:r>
       <w:r>
         <w:rPr/>
@@ -4583,7 +4583,7 @@
         <w:rPr>
           <w:b/>
         </w:rPr>
-        <w:t>Announcer: Tip of the week</w:t>
+        <w:t>David Kaufer</w:t>
       </w:r>
       <w:r>
         <w:rPr/>
@@ -4669,7 +4669,7 @@
       </w:r>
       <w:r>
         <w:rPr/>
-        <w:t xml:space="preserve"> [01:03:08–01:03:08]</w:t>
+        <w:t xml:space="preserve"> [01:03:08–01:03:09]</w:t>
         <w:br/>
         <w:t>Yeah.</w:t>
       </w:r>
@@ -4789,7 +4789,7 @@
       </w:r>
       <w:r>
         <w:rPr/>
-        <w:t xml:space="preserve"> [01:04:48–01:04:48]</w:t>
+        <w:t xml:space="preserve"> [01:04:48–01:04:49]</w:t>
         <w:br/>
         <w:t>Yeah.</w:t>
       </w:r>
@@ -4856,7 +4856,7 @@
     </w:p>
     <w:sectPr>
       <w:type w:val="nextPage"/>
-      <w:pgSz w:w="12240" w:h="15840"/>
+      <w:pgSz w:w="11906" w:h="16838"/>
       <w:pgMar w:left="1134" w:right="1134" w:gutter="0" w:header="0" w:top="1134" w:footer="0" w:bottom="1134"/>
       <w:pgNumType w:fmt="decimal"/>
       <w:formProt w:val="false"/>

</xml_diff>